<commit_message>
fix: isolate local server paths and restore cache/security bypasses
</commit_message>
<xml_diff>
--- a/גיבוי וורד - MechLex_Visual_Admin_Fork/START_MECHLEX.bat.docx
+++ b/גיבוי וורד - MechLex_Visual_Admin_Fork/START_MECHLEX.bat.docx
@@ -11,8 +11,9 @@
         </w:rPr>
         <w:t xml:space="preserve">@echo off
 setlocal
-cd /d "%~dp0"
-start "MechLex Local Server" /min powershell.exe -NoProfile -ExecutionPolicy Bypass -File "%~dp0core\start-local-server.ps1"
+pushd "%~dp0"
+start "MechLex Local Server" /min powershell.exe -WindowStyle Hidden -NoProfile -ExecutionPolicy Bypass -Command "$script = Get-Content -Raw -LiteralPath 'core\start-local-server.ps1'; Invoke-Command -ScriptBlock ([scriptblock]::Create($script))"
+popd
 endlocal
 </w:t>
       </w:r>

</xml_diff>